<commit_message>
Corrección de la planificación
</commit_message>
<xml_diff>
--- a/Planificación.docx
+++ b/Planificación.docx
@@ -5,324 +5,7 @@
     <w:p>
       <w:pPr>
         <w:spacing w:line="360" w:lineRule="auto"/>
-        <w:ind w:left="20" w:right="940"/>
-      </w:pPr>
-      <w:r>
-        <w:t xml:space="preserve">Universidad del Valle de Guatemala </w:t>
-      </w:r>
-    </w:p>
-    <w:p>
-      <w:pPr>
-        <w:spacing w:line="360" w:lineRule="auto"/>
-        <w:ind w:left="20" w:right="940"/>
-      </w:pPr>
-      <w:r>
-        <w:t>Programación Orientada a Objetos</w:t>
-      </w:r>
-    </w:p>
-    <w:p>
-      <w:pPr>
-        <w:spacing w:line="360" w:lineRule="auto"/>
-        <w:ind w:left="20" w:right="940"/>
-      </w:pPr>
-      <w:r>
-        <w:t>Segundo ciclo, 2026</w:t>
-      </w:r>
-    </w:p>
-    <w:p>
-      <w:pPr>
-        <w:spacing w:line="360" w:lineRule="auto"/>
-        <w:ind w:left="20" w:right="940"/>
-      </w:pPr>
-    </w:p>
-    <w:p>
-      <w:pPr>
-        <w:spacing w:line="360" w:lineRule="auto"/>
-        <w:ind w:left="20" w:right="940"/>
-      </w:pPr>
-    </w:p>
-    <w:p>
-      <w:pPr>
-        <w:spacing w:line="360" w:lineRule="auto"/>
-        <w:ind w:left="20" w:right="940"/>
-      </w:pPr>
-    </w:p>
-    <w:p>
-      <w:pPr>
-        <w:spacing w:line="360" w:lineRule="auto"/>
-        <w:ind w:left="20" w:right="940"/>
-      </w:pPr>
-      <w:r>
-        <w:t xml:space="preserve"> </w:t>
-      </w:r>
-    </w:p>
-    <w:p>
-      <w:pPr>
-        <w:spacing w:line="360" w:lineRule="auto"/>
-        <w:ind w:left="20" w:right="940"/>
-      </w:pPr>
-      <w:r>
-        <w:t xml:space="preserve"> </w:t>
-      </w:r>
-    </w:p>
-    <w:p>
-      <w:pPr>
-        <w:spacing w:line="360" w:lineRule="auto"/>
         <w:ind w:right="940"/>
-      </w:pPr>
-      <w:r>
-        <w:t xml:space="preserve"> </w:t>
-      </w:r>
-    </w:p>
-    <w:p>
-      <w:pPr>
-        <w:spacing w:line="360" w:lineRule="auto"/>
-        <w:ind w:right="940"/>
-      </w:pPr>
-      <w:r>
-        <w:t xml:space="preserve"> </w:t>
-      </w:r>
-    </w:p>
-    <w:p>
-      <w:pPr>
-        <w:spacing w:line="360" w:lineRule="auto"/>
-        <w:ind w:right="940"/>
-      </w:pPr>
-      <w:r>
-        <w:t xml:space="preserve"> </w:t>
-      </w:r>
-    </w:p>
-    <w:p>
-      <w:pPr>
-        <w:spacing w:line="360" w:lineRule="auto"/>
-        <w:ind w:left="20" w:right="940"/>
-      </w:pPr>
-      <w:r>
-        <w:t xml:space="preserve"> </w:t>
-      </w:r>
-    </w:p>
-    <w:p>
-      <w:pPr>
-        <w:spacing w:line="360" w:lineRule="auto"/>
-        <w:ind w:left="20" w:right="940"/>
-      </w:pPr>
-      <w:r>
-        <w:t xml:space="preserve"> </w:t>
-      </w:r>
-    </w:p>
-    <w:p>
-      <w:pPr>
-        <w:spacing w:line="360" w:lineRule="auto"/>
-        <w:ind w:left="20" w:right="940"/>
-      </w:pPr>
-      <w:r>
-        <w:t xml:space="preserve"> </w:t>
-      </w:r>
-    </w:p>
-    <w:p>
-      <w:pPr>
-        <w:spacing w:line="360" w:lineRule="auto"/>
-        <w:ind w:left="20" w:right="940"/>
-      </w:pPr>
-      <w:r>
-        <w:t xml:space="preserve"> </w:t>
-      </w:r>
-    </w:p>
-    <w:p>
-      <w:pPr>
-        <w:spacing w:line="360" w:lineRule="auto"/>
-        <w:ind w:left="180" w:right="940"/>
-        <w:jc w:val="center"/>
-      </w:pPr>
-      <w:r>
-        <w:rPr>
-          <w:b/>
-          <w:bCs/>
-        </w:rPr>
-        <w:t>P</w:t>
-      </w:r>
-      <w:r>
-        <w:rPr>
-          <w:b/>
-          <w:bCs/>
-        </w:rPr>
-        <w:t>lanificación</w:t>
-      </w:r>
-    </w:p>
-    <w:p>
-      <w:pPr>
-        <w:spacing w:line="360" w:lineRule="auto"/>
-        <w:ind w:left="20" w:right="940"/>
-      </w:pPr>
-      <w:r>
-        <w:t xml:space="preserve"> </w:t>
-      </w:r>
-    </w:p>
-    <w:p>
-      <w:pPr>
-        <w:spacing w:line="360" w:lineRule="auto"/>
-        <w:ind w:left="20" w:right="940"/>
-      </w:pPr>
-      <w:r>
-        <w:t xml:space="preserve"> </w:t>
-      </w:r>
-    </w:p>
-    <w:p>
-      <w:pPr>
-        <w:spacing w:line="360" w:lineRule="auto"/>
-        <w:ind w:left="20" w:right="940"/>
-      </w:pPr>
-      <w:r>
-        <w:t xml:space="preserve"> </w:t>
-      </w:r>
-    </w:p>
-    <w:p>
-      <w:pPr>
-        <w:spacing w:line="360" w:lineRule="auto"/>
-        <w:ind w:left="20" w:right="940"/>
-      </w:pPr>
-      <w:r>
-        <w:t xml:space="preserve"> </w:t>
-      </w:r>
-    </w:p>
-    <w:p>
-      <w:pPr>
-        <w:spacing w:line="360" w:lineRule="auto"/>
-        <w:ind w:left="20" w:right="940"/>
-      </w:pPr>
-      <w:r>
-        <w:t xml:space="preserve"> </w:t>
-      </w:r>
-    </w:p>
-    <w:p>
-      <w:pPr>
-        <w:spacing w:line="360" w:lineRule="auto"/>
-        <w:ind w:left="20" w:right="940"/>
-      </w:pPr>
-      <w:r>
-        <w:t xml:space="preserve"> </w:t>
-      </w:r>
-    </w:p>
-    <w:p>
-      <w:pPr>
-        <w:spacing w:line="360" w:lineRule="auto"/>
-        <w:ind w:right="940"/>
-      </w:pPr>
-      <w:r>
-        <w:t xml:space="preserve"> </w:t>
-      </w:r>
-    </w:p>
-    <w:p>
-      <w:pPr>
-        <w:spacing w:line="360" w:lineRule="auto"/>
-        <w:ind w:right="940"/>
-      </w:pPr>
-    </w:p>
-    <w:p>
-      <w:pPr>
-        <w:spacing w:line="360" w:lineRule="auto"/>
-        <w:ind w:right="940"/>
-      </w:pPr>
-    </w:p>
-    <w:p>
-      <w:pPr>
-        <w:spacing w:line="360" w:lineRule="auto"/>
-        <w:ind w:right="940"/>
-      </w:pPr>
-    </w:p>
-    <w:p>
-      <w:pPr>
-        <w:spacing w:line="360" w:lineRule="auto"/>
-        <w:ind w:right="940"/>
-      </w:pPr>
-    </w:p>
-    <w:p>
-      <w:pPr>
-        <w:spacing w:line="360" w:lineRule="auto"/>
-        <w:ind w:right="940"/>
-        <w:jc w:val="right"/>
-      </w:pPr>
-      <w:r>
-        <w:t xml:space="preserve"> </w:t>
-      </w:r>
-    </w:p>
-    <w:p>
-      <w:pPr>
-        <w:spacing w:line="360" w:lineRule="auto"/>
-        <w:ind w:left="3260" w:right="940"/>
-        <w:jc w:val="right"/>
-      </w:pPr>
-    </w:p>
-    <w:p>
-      <w:pPr>
-        <w:spacing w:line="360" w:lineRule="auto"/>
-        <w:ind w:left="3260" w:right="940"/>
-        <w:jc w:val="right"/>
-      </w:pPr>
-    </w:p>
-    <w:p>
-      <w:pPr>
-        <w:spacing w:line="360" w:lineRule="auto"/>
-        <w:ind w:left="3260" w:right="940"/>
-        <w:jc w:val="right"/>
-      </w:pPr>
-    </w:p>
-    <w:p>
-      <w:pPr>
-        <w:spacing w:line="360" w:lineRule="auto"/>
-        <w:ind w:left="3260" w:right="940"/>
-        <w:jc w:val="right"/>
-      </w:pPr>
-      <w:proofErr w:type="spellStart"/>
-      <w:r>
-        <w:t>Angel</w:t>
-      </w:r>
-      <w:proofErr w:type="spellEnd"/>
-      <w:r>
-        <w:t xml:space="preserve"> García 26264</w:t>
-      </w:r>
-    </w:p>
-    <w:p>
-      <w:pPr>
-        <w:spacing w:line="360" w:lineRule="auto"/>
-        <w:ind w:left="3260" w:right="940"/>
-        <w:jc w:val="right"/>
-      </w:pPr>
-      <w:r>
-        <w:t>Enmanuel García 26846</w:t>
-      </w:r>
-    </w:p>
-    <w:p>
-      <w:pPr>
-        <w:spacing w:line="360" w:lineRule="auto"/>
-        <w:ind w:left="3260" w:right="940"/>
-        <w:jc w:val="right"/>
-      </w:pPr>
-      <w:r>
-        <w:t>Lourdes Lemus 26305</w:t>
-      </w:r>
-    </w:p>
-    <w:p>
-      <w:pPr>
-        <w:spacing w:line="360" w:lineRule="auto"/>
-        <w:ind w:left="20" w:right="940"/>
-        <w:jc w:val="right"/>
-      </w:pPr>
-      <w:r>
-        <w:t>25/08/26</w:t>
-      </w:r>
-    </w:p>
-    <w:p>
-      <w:pPr>
-        <w:spacing w:line="360" w:lineRule="auto"/>
-        <w:ind w:left="20" w:right="940"/>
-        <w:jc w:val="right"/>
-      </w:pPr>
-    </w:p>
-    <w:p>
-      <w:pPr>
-        <w:spacing w:line="360" w:lineRule="auto"/>
-        <w:ind w:left="20" w:right="940"/>
       </w:pPr>
     </w:p>
     <w:p>
@@ -344,7 +27,6 @@
           <w:sz w:val="24"/>
           <w:szCs w:val="24"/>
         </w:rPr>
-        <w:lastRenderedPageBreak/>
         <w:t>Planificación y Gestión</w:t>
       </w:r>
     </w:p>
@@ -665,13 +347,8 @@
               </w:pBdr>
               <w:spacing w:line="240" w:lineRule="auto"/>
             </w:pPr>
-            <w:proofErr w:type="spellStart"/>
-            <w:r>
-              <w:t>Angel</w:t>
-            </w:r>
-            <w:proofErr w:type="spellEnd"/>
-            <w:r>
-              <w:t xml:space="preserve"> García y Lourdes Lemus</w:t>
+            <w:r>
+              <w:t>Angel García y Lourdes Lemus</w:t>
             </w:r>
           </w:p>
         </w:tc>
@@ -800,13 +477,8 @@
               </w:pBdr>
               <w:spacing w:line="240" w:lineRule="auto"/>
             </w:pPr>
-            <w:proofErr w:type="spellStart"/>
-            <w:r>
-              <w:t>Angel</w:t>
-            </w:r>
-            <w:proofErr w:type="spellEnd"/>
-            <w:r>
-              <w:t xml:space="preserve"> García</w:t>
+            <w:r>
+              <w:t>Angel García</w:t>
             </w:r>
           </w:p>
         </w:tc>
@@ -1121,11 +793,11 @@
               <w:spacing w:line="240" w:lineRule="auto"/>
             </w:pPr>
             <w:r>
-              <w:t xml:space="preserve">Asignación de prioridades a los requisitos </w:t>
+              <w:t xml:space="preserve">Asignación de prioridades a los </w:t>
             </w:r>
             <w:r>
               <w:lastRenderedPageBreak/>
-              <w:t>funcionales según su importancia para el funcionamiento del sistema y su orden de implementación.</w:t>
+              <w:t>requisitos funcionales según su importancia para el funcionamiento del sistema y su orden de implementación.</w:t>
             </w:r>
           </w:p>
         </w:tc>
@@ -1302,13 +974,8 @@
               <w:widowControl w:val="0"/>
               <w:spacing w:line="240" w:lineRule="auto"/>
             </w:pPr>
-            <w:proofErr w:type="spellStart"/>
-            <w:r>
-              <w:t>Angel</w:t>
-            </w:r>
-            <w:proofErr w:type="spellEnd"/>
-            <w:r>
-              <w:t xml:space="preserve"> García</w:t>
+            <w:r>
+              <w:t>Angel García</w:t>
             </w:r>
           </w:p>
         </w:tc>
@@ -1437,13 +1104,8 @@
               </w:pBdr>
               <w:spacing w:line="240" w:lineRule="auto"/>
             </w:pPr>
-            <w:proofErr w:type="spellStart"/>
-            <w:r>
-              <w:t>Angel</w:t>
-            </w:r>
-            <w:proofErr w:type="spellEnd"/>
-            <w:r>
-              <w:t xml:space="preserve"> García</w:t>
+            <w:r>
+              <w:t>Angel García</w:t>
             </w:r>
           </w:p>
         </w:tc>
@@ -1642,11 +1304,11 @@
               <w:spacing w:line="240" w:lineRule="auto"/>
             </w:pPr>
             <w:r>
-              <w:t xml:space="preserve">Investigación y comparación de alternativas para almacenar y conservar los </w:t>
+              <w:t xml:space="preserve">Investigación y comparación de alternativas para almacenar y </w:t>
             </w:r>
             <w:r>
               <w:lastRenderedPageBreak/>
-              <w:t>datos del juego, seleccionando la tecnología de persistencia más adecuada y justificando su elección.</w:t>
+              <w:t>conservar los datos del juego, seleccionando la tecnología de persistencia más adecuada y justificando su elección.</w:t>
             </w:r>
           </w:p>
         </w:tc>
@@ -1743,7 +1405,7 @@
               <w:spacing w:line="240" w:lineRule="auto"/>
             </w:pPr>
             <w:r>
-              <w:t xml:space="preserve">Revisión </w:t>
+              <w:t>Muestra del prototipo al usuario</w:t>
             </w:r>
           </w:p>
         </w:tc>
@@ -1770,59 +1432,54 @@
               <w:spacing w:line="240" w:lineRule="auto"/>
             </w:pPr>
             <w:r>
-              <w:t>Revisión conjunta de los requisitos, clases, diagrama UML, investigaciones, código y documentación para verificar que cumplan con los requisitos de la segunda entrega.</w:t>
-            </w:r>
-          </w:p>
-        </w:tc>
-        <w:tc>
-          <w:tcPr>
-            <w:tcW w:w="1800" w:type="dxa"/>
-            <w:tcMar>
-              <w:top w:w="100" w:type="dxa"/>
-              <w:left w:w="100" w:type="dxa"/>
-              <w:bottom w:w="100" w:type="dxa"/>
-              <w:right w:w="100" w:type="dxa"/>
-            </w:tcMar>
-          </w:tcPr>
-          <w:p>
-            <w:pPr>
-              <w:widowControl w:val="0"/>
-              <w:pBdr>
-                <w:top w:val="nil"/>
-                <w:left w:val="nil"/>
-                <w:bottom w:val="nil"/>
-                <w:right w:val="nil"/>
-                <w:between w:val="nil"/>
-              </w:pBdr>
-              <w:spacing w:line="240" w:lineRule="auto"/>
-            </w:pPr>
-            <w:r>
-              <w:t>2</w:t>
-            </w:r>
-          </w:p>
-        </w:tc>
-        <w:tc>
-          <w:tcPr>
-            <w:tcW w:w="1800" w:type="dxa"/>
-            <w:tcMar>
-              <w:top w:w="100" w:type="dxa"/>
-              <w:left w:w="100" w:type="dxa"/>
-              <w:bottom w:w="100" w:type="dxa"/>
-              <w:right w:w="100" w:type="dxa"/>
-            </w:tcMar>
-          </w:tcPr>
-          <w:p>
-            <w:pPr>
-              <w:widowControl w:val="0"/>
-              <w:spacing w:line="240" w:lineRule="auto"/>
-            </w:pPr>
-            <w:proofErr w:type="spellStart"/>
-            <w:r>
-              <w:t>Angel</w:t>
-            </w:r>
-            <w:proofErr w:type="spellEnd"/>
-            <w:r>
-              <w:t xml:space="preserve"> García, Lourdes Lemus y Enmanuel García</w:t>
+              <w:t>Presentación del prototipo a un usuario potencial para obtener retroalimentación sobre su funcionamiento, claridad y facilidad de uso.</w:t>
+            </w:r>
+          </w:p>
+        </w:tc>
+        <w:tc>
+          <w:tcPr>
+            <w:tcW w:w="1800" w:type="dxa"/>
+            <w:tcMar>
+              <w:top w:w="100" w:type="dxa"/>
+              <w:left w:w="100" w:type="dxa"/>
+              <w:bottom w:w="100" w:type="dxa"/>
+              <w:right w:w="100" w:type="dxa"/>
+            </w:tcMar>
+          </w:tcPr>
+          <w:p>
+            <w:pPr>
+              <w:widowControl w:val="0"/>
+              <w:pBdr>
+                <w:top w:val="nil"/>
+                <w:left w:val="nil"/>
+                <w:bottom w:val="nil"/>
+                <w:right w:val="nil"/>
+                <w:between w:val="nil"/>
+              </w:pBdr>
+              <w:spacing w:line="240" w:lineRule="auto"/>
+            </w:pPr>
+            <w:r>
+              <w:t>1</w:t>
+            </w:r>
+          </w:p>
+        </w:tc>
+        <w:tc>
+          <w:tcPr>
+            <w:tcW w:w="1800" w:type="dxa"/>
+            <w:tcMar>
+              <w:top w:w="100" w:type="dxa"/>
+              <w:left w:w="100" w:type="dxa"/>
+              <w:bottom w:w="100" w:type="dxa"/>
+              <w:right w:w="100" w:type="dxa"/>
+            </w:tcMar>
+          </w:tcPr>
+          <w:p>
+            <w:pPr>
+              <w:widowControl w:val="0"/>
+              <w:spacing w:line="240" w:lineRule="auto"/>
+            </w:pPr>
+            <w:r>
+              <w:t>Ángel García, Lourdes Lemus y Enmanuel García</w:t>
             </w:r>
           </w:p>
         </w:tc>
@@ -1861,6 +1518,129 @@
           <w:p>
             <w:pPr>
               <w:widowControl w:val="0"/>
+              <w:pBdr>
+                <w:top w:val="nil"/>
+                <w:left w:val="nil"/>
+                <w:bottom w:val="nil"/>
+                <w:right w:val="nil"/>
+                <w:between w:val="nil"/>
+              </w:pBdr>
+              <w:spacing w:line="240" w:lineRule="auto"/>
+            </w:pPr>
+            <w:r>
+              <w:t xml:space="preserve">Revisión </w:t>
+            </w:r>
+          </w:p>
+        </w:tc>
+        <w:tc>
+          <w:tcPr>
+            <w:tcW w:w="1875" w:type="dxa"/>
+            <w:tcMar>
+              <w:top w:w="100" w:type="dxa"/>
+              <w:left w:w="100" w:type="dxa"/>
+              <w:bottom w:w="100" w:type="dxa"/>
+              <w:right w:w="100" w:type="dxa"/>
+            </w:tcMar>
+          </w:tcPr>
+          <w:p>
+            <w:pPr>
+              <w:widowControl w:val="0"/>
+              <w:pBdr>
+                <w:top w:val="nil"/>
+                <w:left w:val="nil"/>
+                <w:bottom w:val="nil"/>
+                <w:right w:val="nil"/>
+                <w:between w:val="nil"/>
+              </w:pBdr>
+              <w:spacing w:line="240" w:lineRule="auto"/>
+            </w:pPr>
+            <w:r>
+              <w:t>Revisión conjunta de los requisitos, clases, diagrama UML, investigaciones, código y documentación para verificar que cumplan con los requisitos de la segunda entrega.</w:t>
+            </w:r>
+          </w:p>
+        </w:tc>
+        <w:tc>
+          <w:tcPr>
+            <w:tcW w:w="1800" w:type="dxa"/>
+            <w:tcMar>
+              <w:top w:w="100" w:type="dxa"/>
+              <w:left w:w="100" w:type="dxa"/>
+              <w:bottom w:w="100" w:type="dxa"/>
+              <w:right w:w="100" w:type="dxa"/>
+            </w:tcMar>
+          </w:tcPr>
+          <w:p>
+            <w:pPr>
+              <w:widowControl w:val="0"/>
+              <w:pBdr>
+                <w:top w:val="nil"/>
+                <w:left w:val="nil"/>
+                <w:bottom w:val="nil"/>
+                <w:right w:val="nil"/>
+                <w:between w:val="nil"/>
+              </w:pBdr>
+              <w:spacing w:line="240" w:lineRule="auto"/>
+            </w:pPr>
+            <w:r>
+              <w:t>2</w:t>
+            </w:r>
+          </w:p>
+        </w:tc>
+        <w:tc>
+          <w:tcPr>
+            <w:tcW w:w="1800" w:type="dxa"/>
+            <w:tcMar>
+              <w:top w:w="100" w:type="dxa"/>
+              <w:left w:w="100" w:type="dxa"/>
+              <w:bottom w:w="100" w:type="dxa"/>
+              <w:right w:w="100" w:type="dxa"/>
+            </w:tcMar>
+          </w:tcPr>
+          <w:p>
+            <w:pPr>
+              <w:widowControl w:val="0"/>
+              <w:spacing w:line="240" w:lineRule="auto"/>
+            </w:pPr>
+            <w:r>
+              <w:t>Angel García, Lourdes Lemus y Enmanuel García</w:t>
+            </w:r>
+          </w:p>
+        </w:tc>
+        <w:tc>
+          <w:tcPr>
+            <w:tcW w:w="1800" w:type="dxa"/>
+            <w:tcMar>
+              <w:top w:w="100" w:type="dxa"/>
+              <w:left w:w="100" w:type="dxa"/>
+              <w:bottom w:w="100" w:type="dxa"/>
+              <w:right w:w="100" w:type="dxa"/>
+            </w:tcMar>
+          </w:tcPr>
+          <w:p>
+            <w:pPr>
+              <w:widowControl w:val="0"/>
+              <w:spacing w:line="240" w:lineRule="auto"/>
+            </w:pPr>
+            <w:r>
+              <w:t>18/09/26</w:t>
+            </w:r>
+          </w:p>
+        </w:tc>
+      </w:tr>
+      <w:tr>
+        <w:tc>
+          <w:tcPr>
+            <w:tcW w:w="1725" w:type="dxa"/>
+            <w:tcMar>
+              <w:top w:w="100" w:type="dxa"/>
+              <w:left w:w="100" w:type="dxa"/>
+              <w:bottom w:w="100" w:type="dxa"/>
+              <w:right w:w="100" w:type="dxa"/>
+            </w:tcMar>
+          </w:tcPr>
+          <w:p>
+            <w:pPr>
+              <w:widowControl w:val="0"/>
               <w:spacing w:line="240" w:lineRule="auto"/>
             </w:pPr>
             <w:r>
@@ -1923,13 +1703,8 @@
               <w:widowControl w:val="0"/>
               <w:spacing w:line="240" w:lineRule="auto"/>
             </w:pPr>
-            <w:proofErr w:type="spellStart"/>
-            <w:r>
-              <w:t>Angel</w:t>
-            </w:r>
-            <w:proofErr w:type="spellEnd"/>
-            <w:r>
-              <w:t xml:space="preserve"> García, Lourdes Lemus y Enmanuel García</w:t>
+            <w:r>
+              <w:t>Angel García, Lourdes Lemus y Enmanuel García</w:t>
             </w:r>
           </w:p>
         </w:tc>
@@ -2492,7 +2267,6 @@
   <w:style w:type="character" w:default="1" w:styleId="Fuentedeprrafopredeter">
     <w:name w:val="Default Paragraph Font"/>
     <w:uiPriority w:val="1"/>
-    <w:semiHidden/>
     <w:unhideWhenUsed/>
   </w:style>
   <w:style w:type="table" w:default="1" w:styleId="Tablanormal">

</xml_diff>